<commit_message>
paper.py: wording fixes (jurisdictions, CI formatting, comparator models)
Co-Authored-By: Claude Fable 5.1 <noreply@anthropic.com>
Claude-Session: https://claude.ai/code/session_01Aiw93QsZZztot1nhJhBDLx
</commit_message>
<xml_diff>
--- a/docs/OrthoAppeals-Abstract-Methods-Results.docx
+++ b/docs/OrthoAppeals-Abstract-Methods-Results.docx
@@ -42,7 +42,7 @@
         <w:t xml:space="preserve">Methods. </w:t>
       </w:r>
       <w:r>
-        <w:t>We built 167 simulated denial cases across 51 states and the District of Columbia, 73 insurers, and 14 orthopedic operations, with a synthetic clinical summary for each. Cases were of three kinds: the plan publishes criteria for the operation (n = 120); the plan's public policy names the operation but sends the criteria to a licensed vendor (n = 12); or the plan publishes no policy for the operation (n = 35). Each case was given to OrthoAppeals and to ChatGPT, Claude and Gemini running with web search. The primary outcome was correct identification of the governing policy, scored against a reviewed answer key. Letter outcomes were scored by code against the policy text: whether the letter quoted a criterion that answered the stated denial reason, whether every quotation was really in the policy, and whether the letter was complete enough to send. Paired comparisons used the exact McNemar test.</w:t>
+        <w:t>We built 167 simulated denial cases across all 50 states and the District of Columbia, 73 insurers, and 14 orthopedic operations, with a synthetic clinical summary for each. Cases were of three kinds: the plan publishes criteria for the operation (n = 120); the plan's public policy names the operation but sends the criteria to a licensed vendor (n = 12); or the plan publishes no policy for the operation (n = 35). Each case was given to OrthoAppeals and to ChatGPT, Claude and Gemini running with web search. The primary outcome was correct identification of the governing policy, scored against a reviewed answer key. Letter outcomes were scored by code against the policy text: whether the letter quoted a criterion that answered the stated denial reason, whether every quotation was really in the policy, and whether the letter was complete enough to send. Paired comparisons used the exact McNemar test.</w:t>
       </w:r>
     </w:p>
     <w:p>
@@ -53,7 +53,7 @@
         <w:t xml:space="preserve">Results. </w:t>
       </w:r>
       <w:r>
-        <w:t>OrthoAppeals identified the governing policy in 167 of 167 (100%) cases, ChatGPT in 106 of 167 (63%), Claude in 140 of 167 (84%) and Gemini in 138 of 167 (83%) (each versus OrthoAppeals, P &lt; .001). Where criteria were published, OrthoAppeals quoted a criterion answering the denial in 119 of 120 (99%) letters, Gemini in 109 of 120 (91%), Claude in 80 of 120 (67%) and ChatGPT in 30 of 120 (25%). Quotations that could not be found in the policy appeared in 0 OrthoAppeals letters, 9 ChatGPT, 55 Claude and 51 Gemini letters. Where no policy existed, Gemini named a nonexistent governing document in 19 of 35 (54%) cases. OrthoAppeals' first drafts stated a rule the policy did not contain in 45 of 167 letters; a built-in check caught and corrected every one before delivery.</w:t>
+        <w:t>OrthoAppeals identified the governing policy in 167 of 167 (100%) cases, ChatGPT in 106 of 167 (63%), Claude in 140 of 167 (84%) and Gemini in 138 of 167 (83%) (each versus OrthoAppeals, P &lt; .001). Where criteria were published, OrthoAppeals quoted a criterion answering the denial in 119 of 120 (99%) letters, Gemini in 109 of 120 (91%), Claude in 80 of 120 (67%) and ChatGPT in 30 of 120 (25%). Quotations that could not be found in the policy appeared in 0 OrthoAppeals letters, 9 ChatGPT, 55 Claude and 51 Gemini letters. Where no policy existed, Gemini named a nonexistent governing document in 19 of 35 (54%) cases. A built-in check flagged 45 of 167 OrthoAppeals first drafts for a number, quotation or rule attributed to the plan that was not in the excerpts the writer had, and every one was corrected before delivery.</w:t>
       </w:r>
     </w:p>
     <w:p>
@@ -64,7 +64,7 @@
         <w:t xml:space="preserve">Conclusions. </w:t>
       </w:r>
       <w:r>
-        <w:t>Free chatbots found the governing policy in roughly two of three to four of five cases and, when they quoted it, often misquoted it. A directory-grounded tool identified the policy in every case in which its directory was correct and never quoted text that was not in the document. The audit that produced these results also found and corrected errors in the tool's own directory, and the tool's writer required an automated correction pass to keep invented rules out of its letters.</w:t>
+        <w:t>Free chatbots found the governing policy in 63% to 84% of cases and, when they quoted it, often misquoted it. A directory-grounded tool identified the policy in every case in which its directory was correct and never quoted text that was not in the document. The audit that produced these results also found and corrected errors in the tool's own directory, and the tool's writer required an automated correction pass to keep invented rules out of its letters.</w:t>
       </w:r>
     </w:p>
     <w:p>
@@ -137,7 +137,7 @@
     </w:p>
     <w:p>
       <w:r>
-        <w:t>OrthoAppeals looks the case up in its directory, takes the verbatim criteria for the operation from the section extracted for that document, and drafts a first-person appeal with a language model (Claude Opus 5) that is given only those excerpts, the notice and the clinical summary. Before a letter is delivered, code checks it for any number or quotation attributed to the plan that is not in the excerpts, and a second model read checks for invented rules in words; if either finds anything, the writer receives one revision request naming the sentences. The three comparators were the current free-tier models of ChatGPT (GPT-5.6), Claude (Sonnet 5) and Gemini (3.5 Flash), each run through its vendor's API with the same two tools, web search and page fetch, the same instructions, and a budget of 120 tool calls. Each chatbot first identified the policy, then in the same conversation drafted the appeal letter from the notice and clinical summary.</w:t>
+        <w:t>OrthoAppeals looks the case up in its directory, takes the verbatim criteria for the operation from the section extracted for that document, and drafts a first-person appeal with a language model (Claude Opus 5, the same model family as one comparator) that is given only those excerpts, the notice and the clinical summary. Before a letter is delivered, code checks it for any number or quotation attributed to the plan that is not in the excerpts, and a second model read checks for invented rules in words; if either finds anything, the writer receives one revision request naming the sentences. The three comparators were the models behind the free tiers of ChatGPT (GPT-5.6), Claude (Sonnet 5) and Gemini (3.5 Flash) in September 2026, each run through its vendor's API rather than the consumer app, with the same two tools, web search and page fetch, the same instructions, and a budget of 120 tool calls. Each chatbot first identified the policy, then in the same conversation drafted the appeal letter from the notice and clinical summary.</w:t>
       </w:r>
     </w:p>
     <w:p>
@@ -194,7 +194,7 @@
     </w:p>
     <w:p>
       <w:r>
-        <w:t>Policy identification (Table 2). OrthoAppeals cited the governing policy in every case (167 of 167 (100%); 95% CI 98–100%). ChatGPT did so in 106 of 167 (63%) (95% CI 56–70%), Claude in 140 of 167 (84%) (77–89%) and Gemini in 138 of 167 (83%) (76–88%). In paired comparison OrthoAppeals was correct where the chatbot was not in 61 cases against ChatGPT, 27 against Claude and 29 against Gemini, and the reverse never occurred (all P &lt; .001). Claude and Gemini did not differ (P = 0.86); both outperformed ChatGPT (P &lt; .001 and P &lt; .001).</w:t>
+        <w:t>Policy identification (Table 2). OrthoAppeals cited the governing policy in every case (167 of 167 (100%; 95% CI 98–100%)). ChatGPT did so in 106 of 167 (63%; 95% CI 56–70%), Claude in 140 of 167 (84%; 95% CI 77–89%) and Gemini in 138 of 167 (83%; 95% CI 76–88%). In paired comparison OrthoAppeals was correct where the chatbot was not in 61 cases against ChatGPT, 27 against Claude and 29 against Gemini, and the reverse never occurred (all P &lt; .001). Claude and Gemini did not differ (P = 0.86); both outperformed ChatGPT (P &lt; .001 and P &lt; .001).</w:t>
       </w:r>
     </w:p>
     <w:p>

</xml_diff>